<commit_message>
Add script to generate satellite snapshots for specified locations
- Implemented a new Python script `generate_satellite_snapshots.py` that fetches satellite images for predefined candidate locations.
- The script calculates tile coordinates based on latitude and longitude, retrieves the images from Google Maps, and renders them into a single image with markers.
- Saved generated images in the `assets` directory with appropriate naming conventions.
</commit_message>
<xml_diff>
--- a/Partnership-Deed-Revised.docx
+++ b/Partnership-Deed-Revised.docx
@@ -829,12 +829,7 @@
         <w:jc w:val="both"/>
       </w:pPr>
       <w:r>
-        <w:rPr>
-          <w:rFonts w:ascii="Georgia" w:cs="Georgia" w:eastAsia="Georgia" w:hAnsi="Georgia"/>
-          <w:sz w:val="24"/>
-          <w:szCs w:val="24"/>
-        </w:rPr>
-        <w:t xml:space="preserve">The place of business shall be at Door No. 7-2-1813/5/A/1/5038, Rolin Arcade, Street No. 1, Czech Colony, Sanathnagar, Hyderabad, Telangana – 500018 and/or such other places as the Partners may from time to time determine.</w:t>
+        <w:t>The place of business shall be at 8-3-945/8/18&amp;19 Pancom Business Centre, Ameerpet, Hyderabad, 500073, Telangana and/or such other places as the Partners may from time to time determine.</w:t>
       </w:r>
     </w:p>
     <w:p>

</xml_diff>